<commit_message>
Fill in actual student names, guide, and department in report
Students: Mopada Jaganmohan (2433144441), Latchupatula Reshma
(24331A4434), Pati Narasimha Murthy (2433144446), Kada Augusttn
Paul Kumar (24331A4426)
Guide: Mrs. S. Nikhila, Assistant Professor
Department: Data Science

🤖 Generated with Codebuff
Co-Authored-By: Codebuff <noreply@codebuff.com>
</commit_message>
<xml_diff>
--- a/SmartGarbage_Community_Project_Report.docx
+++ b/SmartGarbage_Community_Project_Report.docx
@@ -80,7 +80,7 @@
           <w:i w:val="0"/>
           <w:sz w:val="24"/>
         </w:rPr>
-        <w:t>Name 1  (Reg No. 1)</w:t>
+        <w:t>MOPADA JAGANMOHAN  (2433144441)</w:t>
       </w:r>
     </w:p>
     <w:p>
@@ -95,7 +95,7 @@
           <w:i w:val="0"/>
           <w:sz w:val="24"/>
         </w:rPr>
-        <w:t>Name 2  (Reg No. 2)</w:t>
+        <w:t>LATCHUPATULA RESHMA  (24331A4434)</w:t>
       </w:r>
     </w:p>
     <w:p>
@@ -110,7 +110,7 @@
           <w:i w:val="0"/>
           <w:sz w:val="24"/>
         </w:rPr>
-        <w:t>Name 3  (Reg No. 3)</w:t>
+        <w:t>PATI NARASIMHA MURTHY  (2433144446)</w:t>
       </w:r>
     </w:p>
     <w:p>
@@ -125,7 +125,7 @@
           <w:i w:val="0"/>
           <w:sz w:val="24"/>
         </w:rPr>
-        <w:t>Name 4  (Reg No. 4)</w:t>
+        <w:t>KADA AUGUSTTN PAUL KUMAR  (24331A4426)</w:t>
       </w:r>
     </w:p>
     <w:p/>
@@ -231,7 +231,7 @@
           <w:i w:val="0"/>
           <w:sz w:val="28"/>
         </w:rPr>
-        <w:t>GUIDE NAME</w:t>
+        <w:t>Mrs. S. Nikhila</w:t>
       </w:r>
     </w:p>
     <w:p>
@@ -246,7 +246,7 @@
           <w:i w:val="0"/>
           <w:sz w:val="24"/>
         </w:rPr>
-        <w:t>DESIGNATION</w:t>
+        <w:t>Assistant Professor</w:t>
       </w:r>
     </w:p>
     <w:p/>
@@ -262,7 +262,7 @@
           <w:i w:val="0"/>
           <w:sz w:val="24"/>
         </w:rPr>
-        <w:t>DEPARTMENT OF DATA ENGINEERING</w:t>
+        <w:t>DEPARTMENT OF DATA SCIENCE</w:t>
       </w:r>
     </w:p>
     <w:p>
@@ -292,7 +292,7 @@
           <w:i w:val="0"/>
           <w:sz w:val="20"/>
         </w:rPr>
-        <w:t>(Approved by AICTE, New Delhi, and permanently affiliated to JNTUGV, Vizianagaram)</w:t>
+        <w:t>(Approved by AICTE, New Delhi, and permanently affiliated to JNTUGV, Vizianagaram), Listed u/s 2(f) &amp; 12(B) of UGC Act 1956.</w:t>
       </w:r>
     </w:p>
     <w:p>
@@ -358,7 +358,7 @@
           <w:i w:val="0"/>
           <w:sz w:val="24"/>
         </w:rPr>
-        <w:t>This is to certify that the project entitled "SmartGarbage Chintalavalasa — Community-Based Smart Waste Management and Digital Governance System" is the bonafide work carried out by Name 1 (Reg No. 1), Name 2 (Reg No. 2), Name 3 (Reg No. 3), and Name 4 (Reg No. 4), of B.Tech V Sem CSE-AIML, M.V.G.R. College of Engineering (Autonomous), Vizianagaram, during the year 2025-2026, in partial fulfilment of the requirements for the award of the Degree of Bachelor of Technology and that the project has not formed the basis for the award previously of any degree or any other similar title.</w:t>
+        <w:t>This is to certify that the project entitled "SmartGarbage Chintalavalasa — Community-Based Smart Waste Management and Digital Governance System" is the bonafide work carried out by Mopada Jaganmohan (2433144441), Latchupatula Reshma (24331A4434), Pati Narasimha Murthy (2433144446), and Kada Augusttn Paul Kumar (24331A4426), of B.Tech V Sem CSE-AIML, M.V.G.R. College of Engineering (Autonomous), Vizianagaram, during the year 2025-2026, in partial fulfilment of the requirements for the award of the Degree of Bachelor of Technology and that the project has not formed the basis for the award previously of any degree or any other similar title.</w:t>
       </w:r>
     </w:p>
     <w:p/>
@@ -389,11 +389,11 @@
           <w:i w:val="0"/>
           <w:sz w:val="24"/>
         </w:rPr>
-        <w:t>Name</w:t>
+        <w:t>Mrs. S. Nikhila</w:t>
         <w:br/>
-        <w:t>Designation</w:t>
+        <w:t>Assistant Professor</w:t>
         <w:br/>
-        <w:t>Department: Data Engineering</w:t>
+        <w:t>Department: Data Science</w:t>
       </w:r>
     </w:p>
     <w:p>
@@ -427,7 +427,7 @@
         <w:br/>
         <w:t>Designation</w:t>
         <w:br/>
-        <w:t>Department: Data Engineering</w:t>
+        <w:t>Department: Data Science</w:t>
       </w:r>
     </w:p>
     <w:p>
@@ -479,7 +479,7 @@
           <w:i w:val="0"/>
           <w:sz w:val="24"/>
         </w:rPr>
-        <w:t>Name 1 (Reg No. 1)</w:t>
+        <w:t>MOPADA JAGANMOHAN (2433144441)</w:t>
       </w:r>
     </w:p>
     <w:p>
@@ -494,7 +494,7 @@
           <w:i w:val="0"/>
           <w:sz w:val="24"/>
         </w:rPr>
-        <w:t>Name 2 (Reg No. 2)</w:t>
+        <w:t>LATCHUPATULA RESHMA (24331A4434)</w:t>
       </w:r>
     </w:p>
     <w:p>
@@ -509,7 +509,7 @@
           <w:i w:val="0"/>
           <w:sz w:val="24"/>
         </w:rPr>
-        <w:t>Name 3 (Reg No. 3)</w:t>
+        <w:t>PATI NARASIMHA MURTHY (2433144446)</w:t>
       </w:r>
     </w:p>
     <w:p>
@@ -524,7 +524,7 @@
           <w:i w:val="0"/>
           <w:sz w:val="24"/>
         </w:rPr>
-        <w:t>Name 4 (Reg No. 4)</w:t>
+        <w:t>KADA AUGUSTTN PAUL KUMAR (24331A4426)</w:t>
       </w:r>
     </w:p>
     <w:p>
@@ -590,7 +590,7 @@
           <w:i w:val="0"/>
           <w:sz w:val="24"/>
         </w:rPr>
-        <w:t>We also acknowledge the dedicated assistance provided by all the staff members in the Department of Data Engineering. Finally, we appreciate the contributions of all those who directly or indirectly contributed to the successful execution of this endeavor.</w:t>
+        <w:t>We also acknowledge the dedicated assistance provided by all the staff members in the Department of Data Science. Finally, we appreciate the contributions of all those who directly or indirectly contributed to the successful execution of this endeavor.</w:t>
       </w:r>
     </w:p>
     <w:p>

</xml_diff>

<commit_message>
Change degree from CSE-AIML to CSE-DS (Data Science) throughout report
🤖 Generated with Codebuff
Co-Authored-By: Codebuff <noreply@codebuff.com>
</commit_message>
<xml_diff>
--- a/SmartGarbage_Community_Project_Report.docx
+++ b/SmartGarbage_Community_Project_Report.docx
@@ -201,7 +201,7 @@
           <w:i w:val="0"/>
           <w:sz w:val="24"/>
         </w:rPr>
-        <w:t>(Artificial Intelligence &amp; Machine Learning)</w:t>
+        <w:t>(Data Science)</w:t>
       </w:r>
     </w:p>
     <w:p>
@@ -358,7 +358,7 @@
           <w:i w:val="0"/>
           <w:sz w:val="24"/>
         </w:rPr>
-        <w:t>This is to certify that the project entitled "SmartGarbage Chintalavalasa — Community-Based Smart Waste Management and Digital Governance System" is the bonafide work carried out by Mopada Jaganmohan (2433144441), Latchupatula Reshma (24331A4434), Pati Narasimha Murthy (2433144446), and Kada Augusttn Paul Kumar (24331A4426), of B.Tech V Sem CSE-AIML, M.V.G.R. College of Engineering (Autonomous), Vizianagaram, during the year 2025-2026, in partial fulfilment of the requirements for the award of the Degree of Bachelor of Technology and that the project has not formed the basis for the award previously of any degree or any other similar title.</w:t>
+        <w:t>This is to certify that the project entitled "SmartGarbage Chintalavalasa — Community-Based Smart Waste Management and Digital Governance System" is the bonafide work carried out by Mopada Jaganmohan (2433144441), Latchupatula Reshma (24331A4434), Pati Narasimha Murthy (2433144446), and Kada Augusttn Paul Kumar (24331A4426), of B.Tech V Sem CSE-DS, M.V.G.R. College of Engineering (Autonomous), Vizianagaram, during the year 2025-2026, in partial fulfilment of the requirements for the award of the Degree of Bachelor of Technology and that the project has not formed the basis for the award previously of any degree or any other similar title.</w:t>
       </w:r>
     </w:p>
     <w:p/>
@@ -463,7 +463,7 @@
           <w:i w:val="0"/>
           <w:sz w:val="24"/>
         </w:rPr>
-        <w:t>We hereby declare that the work done on the dissertation entitled "SmartGarbage Chintalavalasa — Community-Based Smart Waste Management and Digital Governance System" has been carried out by us and submitted in partial fulfilment for the award of credits in Bachelor of Technology in Computer Science and Engineering (Artificial Intelligence &amp; Machine Learning) of M.V.G.R College of Engineering (Autonomous) and affiliated to JNTUGV, Vizianagaram. The various contents incorporated in the dissertation have not been submitted for the award of any degree of any other institution or university.</w:t>
+        <w:t>We hereby declare that the work done on the dissertation entitled "SmartGarbage Chintalavalasa — Community-Based Smart Waste Management and Digital Governance System" has been carried out by us and submitted in partial fulfilment for the award of credits in Bachelor of Technology in Computer Science and Engineering (Data Science) of M.V.G.R College of Engineering (Autonomous) and affiliated to JNTUGV, Vizianagaram. The various contents incorporated in the dissertation have not been submitted for the award of any degree of any other institution or university.</w:t>
       </w:r>
     </w:p>
     <w:p/>

</xml_diff>

<commit_message>
Fill HOD signature block with Dr. Jyothi in certificate
All template fields now populated:
- Students: Jaganmohan, Reshma, Narasimha Murthy, Augusttn Paul Kumar
- Guide: Mrs. S. Nikhila, Assistant Professor
- HOD: Dr. Jyothi, Head of Department
- Department: Data Science

🤖 Generated with Codebuff
Co-Authored-By: Codebuff <noreply@codebuff.com>
</commit_message>
<xml_diff>
--- a/SmartGarbage_Community_Project_Report.docx
+++ b/SmartGarbage_Community_Project_Report.docx
@@ -423,9 +423,9 @@
           <w:i w:val="0"/>
           <w:sz w:val="24"/>
         </w:rPr>
-        <w:t>Name</w:t>
+        <w:t>Dr. Jyothi</w:t>
         <w:br/>
-        <w:t>Designation</w:t>
+        <w:t>Head of the Department</w:t>
         <w:br/>
         <w:t>Department: Data Science</w:t>
       </w:r>

</xml_diff>

<commit_message>
Fix department to Data Engineering, keep degree as Data Science
Department: Data Engineering (all signature blocks, acknowledgement)
Degree: CSE-DS (Data Science) — title page and declaration

🤖 Generated with Codebuff
Co-Authored-By: Codebuff <noreply@codebuff.com>
</commit_message>
<xml_diff>
--- a/SmartGarbage_Community_Project_Report.docx
+++ b/SmartGarbage_Community_Project_Report.docx
@@ -262,7 +262,7 @@
           <w:i w:val="0"/>
           <w:sz w:val="24"/>
         </w:rPr>
-        <w:t>DEPARTMENT OF DATA SCIENCE</w:t>
+        <w:t>DEPARTMENT OF DATA ENGINEERING</w:t>
       </w:r>
     </w:p>
     <w:p>
@@ -393,7 +393,7 @@
         <w:br/>
         <w:t>Assistant Professor</w:t>
         <w:br/>
-        <w:t>Department: Data Science</w:t>
+        <w:t>Department: Data Engineering</w:t>
       </w:r>
     </w:p>
     <w:p>
@@ -427,7 +427,7 @@
         <w:br/>
         <w:t>Head of the Department</w:t>
         <w:br/>
-        <w:t>Department: Data Science</w:t>
+        <w:t>Department: Data Engineering</w:t>
       </w:r>
     </w:p>
     <w:p>
@@ -590,7 +590,7 @@
           <w:i w:val="0"/>
           <w:sz w:val="24"/>
         </w:rPr>
-        <w:t>We also acknowledge the dedicated assistance provided by all the staff members in the Department of Data Science. Finally, we appreciate the contributions of all those who directly or indirectly contributed to the successful execution of this endeavor.</w:t>
+        <w:t>We also acknowledge the dedicated assistance provided by all the staff members in the Department of Data Engineering. Finally, we appreciate the contributions of all those who directly or indirectly contributed to the successful execution of this endeavor.</w:t>
       </w:r>
     </w:p>
     <w:p>

</xml_diff>

<commit_message>
Rewrite abstract: clear problem-solution-scope without tech stack
Abstract now follows academic structure:
1. Problem statement (waste management challenges)
2. Solution (SmartGarbage platform capabilities)
3. Features (IoT, ML, PAYT, Green Points)
4. Offline/bilingual support
5. Deployment status and limitations
6. Real-world scope

No technical implementation details in abstract.
Both DOCX and PDF updated.

🤖 Generated with Codebuff
Co-Authored-By: Codebuff <noreply@codebuff.com>
</commit_message>
<xml_diff>
--- a/SmartGarbage_Community_Project_Report.docx
+++ b/SmartGarbage_Community_Project_Report.docx
@@ -626,7 +626,7 @@
           <w:i w:val="0"/>
           <w:sz w:val="24"/>
         </w:rPr>
-        <w:t>Rapid urbanization and population growth in semi-urban regions such as Chintalavalasa, Andhra Pradesh, have intensified waste management challenges. Existing systems rely heavily on manual collection schedules, paper-based complaint tracking, and limited citizen participation, leading to overflowing bins, delayed complaint resolution, and environmental degradation.</w:t>
+        <w:t>Waste management in semi-urban Indian communities such as Chintalavalasa, Andhra Pradesh, faces significant challenges. Collection schedules are communicated informally, complaint tracking is paper-based, and citizens have no transparent mechanism to report issues or monitor resolution. Overflowing bins, delayed response times, and lack of accountability are common, with no data-driven approach to allocate resources or predict collection needs.</w:t>
       </w:r>
     </w:p>
     <w:p>
@@ -641,7 +641,7 @@
           <w:i w:val="0"/>
           <w:sz w:val="24"/>
         </w:rPr>
-        <w:t>This project presents SmartGarbage Chintalavalasa, a community-based smart waste management and digital governance system designed for the Chintalavalasa Gram Panchayat. The system integrates multiple technologies — a Flask-based web application, PostgreSQL database, IoT smart-bin telemetry, machine learning predictions using a RandomForest regressor, Progressive Web App offline capabilities, and a pay-as-you-throw billing mechanism — into a single, unified platform accessible to citizens, administrators, and sanitation workers.</w:t>
+        <w:t>This project presents SmartGarbage, a community-based smart waste management system designed for the Chintalavalasa Gram Panchayat. The system provides a unified digital platform where citizens can check waste collection schedules, report missed pickups with photographic evidence and GPS location, and track complaint resolution in real time. Administrators can monitor operations through a live dashboard, assign workers, and view ward-level analytics. Sanitation workers receive dispatch notifications and can upload proof of completion directly from the field.</w:t>
       </w:r>
     </w:p>
     <w:p>
@@ -656,7 +656,7 @@
           <w:i w:val="0"/>
           <w:sz w:val="24"/>
         </w:rPr>
-        <w:t>The platform provides five core portals: a Public Portal for waste collection schedules and complaint filing; a Citizen Portal for tracking complaints and earning Green Points; an Admin Portal for real-time dashboard monitoring, worker dispatch, and analytics; and a Worker Portal for GPS-tracked field operations. IoT-enabled smart bins report fill levels, battery status, temperature, and methane readings through authenticated API endpoints. A machine learning module predicts overflow risk based on historical and synthetic data, enabling proactive dispatch. The system supports bilingual communication, web push notifications for complaint status updates, background job processing via Redis Queue, and comprehensive security measures including OWASP-aligned protections.</w:t>
+        <w:t>Beyond basic complaint management, the system introduces IoT-enabled smart bins that monitor fill levels, battery status, and environmental conditions, enabling proactive collection before overflow occurs. A machine learning module predicts bin overflow risk, allowing administrators to prioritize dispatch based on urgency. The platform also implements a pay-as-you-throw billing mechanism that charges residents based on the residual (non-segregated) waste they generate, incentivizing proper source segregation. A gamification feature called Green Points rewards citizens for consistent waste segregation behaviour.</w:t>
       </w:r>
     </w:p>
     <w:p>
@@ -671,7 +671,22 @@
           <w:i w:val="0"/>
           <w:sz w:val="24"/>
         </w:rPr>
-        <w:t>Testing and evaluation indicate that the prototype achieves a homepage TTFB of approximately 0.5 seconds, serves compressed responses via Brotli/Gzip, implements all nine recommended HTTP security headers, and passes automated accessibility checks. While the current deployment uses synthetic data for ML model training and simulated IoT telemetry, the architecture is designed for seamless integration with real-world sensor data and community-scale deployment.</w:t>
+        <w:t>The system is designed for low-connectivity environments through Progressive Web App capabilities that allow complaint filing and schedule access even without an internet connection, with automatic synchronization when connectivity is restored. Bilingual support in English and Telugu ensures accessibility across different literacy levels. Comprehensive security measures protect user data and system integrity.</w:t>
+      </w:r>
+    </w:p>
+    <w:p>
+      <w:pPr>
+        <w:spacing w:after="120" w:before="0" w:line="240" w:lineRule="auto"/>
+        <w:jc w:val="both"/>
+      </w:pPr>
+      <w:r>
+        <w:rPr>
+          <w:rFonts w:ascii="Times New Roman" w:hAnsi="Times New Roman" w:eastAsia="Times New Roman"/>
+          <w:b w:val="0"/>
+          <w:i w:val="0"/>
+          <w:sz w:val="24"/>
+        </w:rPr>
+        <w:t>The prototype has been deployed and tested for the Chintalavalasa community. While the current implementation uses synthetic data for machine learning training and simulated IoT telemetry — as real-world sensor hardware and historical data are not yet available at community scale — the architecture is designed for seamless integration with physical sensors and real usage data. The project demonstrates how low-cost, open-source digital infrastructure can bring transparency, accountability, and data-driven governance to waste management in semi-urban Indian panchayats.</w:t>
       </w:r>
     </w:p>
     <w:p>
@@ -686,7 +701,7 @@
           <w:i/>
           <w:sz w:val="24"/>
         </w:rPr>
-        <w:t>Keywords: Smart Waste Management, IoT, Machine Learning, PWA, Flask, Community Governance, PAYT Billing, Digital India</w:t>
+        <w:t>Keywords: Smart Waste Management, Community Governance, IoT, Machine Learning, Digital India, PWA, PAYT Billing</w:t>
       </w:r>
     </w:p>
     <w:p>

</xml_diff>

<commit_message>
Simplify abstract + add MVGR college logo to title page
Abstract: 5 short clear sentences, no keywords, no tech stack
Logo: MVGR emblem with lamp icon on title page (DOCX + PDF)

🤖 Generated with Codebuff
Co-Authored-By: Codebuff <noreply@codebuff.com>
</commit_message>
<xml_diff>
--- a/SmartGarbage_Community_Project_Report.docx
+++ b/SmartGarbage_Community_Project_Report.docx
@@ -5,6 +5,46 @@
     <w:p/>
     <w:p/>
     <w:p/>
+    <w:p>
+      <w:pPr>
+        <w:spacing w:after="240"/>
+        <w:jc w:val="center"/>
+      </w:pPr>
+      <w:r>
+        <w:drawing>
+          <wp:inline xmlns:a="http://schemas.openxmlformats.org/drawingml/2006/main" xmlns:pic="http://schemas.openxmlformats.org/drawingml/2006/picture">
+            <wp:extent cx="1828800" cy="1828800"/>
+            <wp:docPr id="1" name="Picture 1"/>
+            <wp:cNvGraphicFramePr>
+              <a:graphicFrameLocks noChangeAspect="1"/>
+            </wp:cNvGraphicFramePr>
+            <a:graphic>
+              <a:graphicData uri="http://schemas.openxmlformats.org/drawingml/2006/picture">
+                <pic:pic>
+                  <pic:nvPicPr>
+                    <pic:cNvPr id="0" name="mvgr_logo.png"/>
+                    <pic:cNvPicPr/>
+                  </pic:nvPicPr>
+                  <pic:blipFill>
+                    <a:blip r:embed="rId9"/>
+                    <a:stretch>
+                      <a:fillRect/>
+                    </a:stretch>
+                  </pic:blipFill>
+                  <pic:spPr>
+                    <a:xfrm>
+                      <a:off x="0" y="0"/>
+                      <a:ext cx="1828800" cy="1828800"/>
+                    </a:xfrm>
+                    <a:prstGeom prst="rect"/>
+                  </pic:spPr>
+                </pic:pic>
+              </a:graphicData>
+            </a:graphic>
+          </wp:inline>
+        </w:drawing>
+      </w:r>
+    </w:p>
     <w:p>
       <w:pPr>
         <w:spacing w:after="480" w:before="0" w:line="240" w:lineRule="auto"/>
@@ -626,7 +666,7 @@
           <w:i w:val="0"/>
           <w:sz w:val="24"/>
         </w:rPr>
-        <w:t>Waste management in semi-urban Indian communities such as Chintalavalasa, Andhra Pradesh, faces significant challenges. Collection schedules are communicated informally, complaint tracking is paper-based, and citizens have no transparent mechanism to report issues or monitor resolution. Overflowing bins, delayed response times, and lack of accountability are common, with no data-driven approach to allocate resources or predict collection needs.</w:t>
+        <w:t>Waste management in semi-urban Indian communities like Chintalavalasa, Andhra Pradesh, is plagued by informal collection schedules, paper-based complaint tracking, and overflowing bins with no accountability.</w:t>
       </w:r>
     </w:p>
     <w:p>
@@ -641,7 +681,7 @@
           <w:i w:val="0"/>
           <w:sz w:val="24"/>
         </w:rPr>
-        <w:t>This project presents SmartGarbage, a community-based smart waste management system designed for the Chintalavalasa Gram Panchayat. The system provides a unified digital platform where citizens can check waste collection schedules, report missed pickups with photographic evidence and GPS location, and track complaint resolution in real time. Administrators can monitor operations through a live dashboard, assign workers, and view ward-level analytics. Sanitation workers receive dispatch notifications and can upload proof of completion directly from the field.</w:t>
+        <w:t>SmartGarbage is a community-based smart waste management system built for the Chintalavalasa Gram Panchayat. It lets citizens check collection schedules, report missed pickups with photos and GPS, and track complaint resolution in real time. Administrators monitor operations through a live dashboard, assign workers, and view ward-level analytics.</w:t>
       </w:r>
     </w:p>
     <w:p>
@@ -656,7 +696,7 @@
           <w:i w:val="0"/>
           <w:sz w:val="24"/>
         </w:rPr>
-        <w:t>Beyond basic complaint management, the system introduces IoT-enabled smart bins that monitor fill levels, battery status, and environmental conditions, enabling proactive collection before overflow occurs. A machine learning module predicts bin overflow risk, allowing administrators to prioritize dispatch based on urgency. The platform also implements a pay-as-you-throw billing mechanism that charges residents based on the residual (non-segregated) waste they generate, incentivizing proper source segregation. A gamification feature called Green Points rewards citizens for consistent waste segregation behaviour.</w:t>
+        <w:t>The system uses IoT-enabled smart bins to monitor fill levels and predict overflow risk, enabling proactive collection. A pay-as-you-throw billing mechanism charges residents for non-segregated waste, encouraging proper segregation. Green Points gamification rewards citizens for consistent segregation behaviour.</w:t>
       </w:r>
     </w:p>
     <w:p>
@@ -671,7 +711,7 @@
           <w:i w:val="0"/>
           <w:sz w:val="24"/>
         </w:rPr>
-        <w:t>The system is designed for low-connectivity environments through Progressive Web App capabilities that allow complaint filing and schedule access even without an internet connection, with automatic synchronization when connectivity is restored. Bilingual support in English and Telugu ensures accessibility across different literacy levels. Comprehensive security measures protect user data and system integrity.</w:t>
+        <w:t>For low-connectivity areas, Progressive Web App capabilities allow offline complaint filing with automatic sync. Bilingual support in English and Telugu ensures wide accessibility.</w:t>
       </w:r>
     </w:p>
     <w:p>
@@ -686,7 +726,7 @@
           <w:i w:val="0"/>
           <w:sz w:val="24"/>
         </w:rPr>
-        <w:t>The prototype has been deployed and tested for the Chintalavalasa community. While the current implementation uses synthetic data for machine learning training and simulated IoT telemetry — as real-world sensor hardware and historical data are not yet available at community scale — the architecture is designed for seamless integration with physical sensors and real usage data. The project demonstrates how low-cost, open-source digital infrastructure can bring transparency, accountability, and data-driven governance to waste management in semi-urban Indian panchayats.</w:t>
+        <w:t>The prototype is deployed and tested for Chintalavalasa. While synthetic data is used for machine learning training and IoT telemetry is simulated, the architecture is ready for real sensor integration and community-scale deployment.</w:t>
       </w:r>
     </w:p>
     <w:p>
@@ -701,7 +741,7 @@
           <w:i/>
           <w:sz w:val="24"/>
         </w:rPr>
-        <w:t>Keywords: Smart Waste Management, Community Governance, IoT, Machine Learning, Digital India, PWA, PAYT Billing</w:t>
+        <w:t>Keywords: Smart Waste Management, Community Governance, IoT, Machine Learning, Digital India</w:t>
       </w:r>
     </w:p>
     <w:p>
@@ -5568,7 +5608,7 @@
         <w:drawing>
           <wp:inline xmlns:a="http://schemas.openxmlformats.org/drawingml/2006/main" xmlns:pic="http://schemas.openxmlformats.org/drawingml/2006/picture">
             <wp:extent cx="5029200" cy="3536255"/>
-            <wp:docPr id="1" name="Picture 1"/>
+            <wp:docPr id="2" name="Picture 2"/>
             <wp:cNvGraphicFramePr>
               <a:graphicFrameLocks noChangeAspect="1"/>
             </wp:cNvGraphicFramePr>
@@ -5580,7 +5620,7 @@
                     <pic:cNvPicPr/>
                   </pic:nvPicPr>
                   <pic:blipFill>
-                    <a:blip r:embed="rId9"/>
+                    <a:blip r:embed="rId10"/>
                     <a:stretch>
                       <a:fillRect/>
                     </a:stretch>
@@ -6459,7 +6499,7 @@
         <w:drawing>
           <wp:inline xmlns:a="http://schemas.openxmlformats.org/drawingml/2006/main" xmlns:pic="http://schemas.openxmlformats.org/drawingml/2006/picture">
             <wp:extent cx="5029200" cy="5602843"/>
-            <wp:docPr id="2" name="Picture 2"/>
+            <wp:docPr id="3" name="Picture 3"/>
             <wp:cNvGraphicFramePr>
               <a:graphicFrameLocks noChangeAspect="1"/>
             </wp:cNvGraphicFramePr>
@@ -6471,7 +6511,7 @@
                     <pic:cNvPicPr/>
                   </pic:nvPicPr>
                   <pic:blipFill>
-                    <a:blip r:embed="rId10"/>
+                    <a:blip r:embed="rId11"/>
                     <a:stretch>
                       <a:fillRect/>
                     </a:stretch>
@@ -6589,7 +6629,7 @@
         <w:drawing>
           <wp:inline xmlns:a="http://schemas.openxmlformats.org/drawingml/2006/main" xmlns:pic="http://schemas.openxmlformats.org/drawingml/2006/picture">
             <wp:extent cx="5029200" cy="3049150"/>
-            <wp:docPr id="3" name="Picture 3"/>
+            <wp:docPr id="4" name="Picture 4"/>
             <wp:cNvGraphicFramePr>
               <a:graphicFrameLocks noChangeAspect="1"/>
             </wp:cNvGraphicFramePr>
@@ -6601,7 +6641,7 @@
                     <pic:cNvPicPr/>
                   </pic:nvPicPr>
                   <pic:blipFill>
-                    <a:blip r:embed="rId11"/>
+                    <a:blip r:embed="rId12"/>
                     <a:stretch>
                       <a:fillRect/>
                     </a:stretch>
@@ -6724,7 +6764,7 @@
         <w:drawing>
           <wp:inline xmlns:a="http://schemas.openxmlformats.org/drawingml/2006/main" xmlns:pic="http://schemas.openxmlformats.org/drawingml/2006/picture">
             <wp:extent cx="5029200" cy="3049150"/>
-            <wp:docPr id="4" name="Picture 4"/>
+            <wp:docPr id="5" name="Picture 5"/>
             <wp:cNvGraphicFramePr>
               <a:graphicFrameLocks noChangeAspect="1"/>
             </wp:cNvGraphicFramePr>
@@ -6736,7 +6776,7 @@
                     <pic:cNvPicPr/>
                   </pic:nvPicPr>
                   <pic:blipFill>
-                    <a:blip r:embed="rId12"/>
+                    <a:blip r:embed="rId13"/>
                     <a:stretch>
                       <a:fillRect/>
                     </a:stretch>

</xml_diff>

<commit_message>
Use SmartGarbage project icon on title page
🤖 Generated with Codebuff
Co-Authored-By: Codebuff <noreply@codebuff.com>
</commit_message>
<xml_diff>
--- a/SmartGarbage_Community_Project_Report.docx
+++ b/SmartGarbage_Community_Project_Report.docx
@@ -7,13 +7,13 @@
     <w:p/>
     <w:p>
       <w:pPr>
-        <w:spacing w:after="240"/>
+        <w:spacing w:after="160"/>
         <w:jc w:val="center"/>
       </w:pPr>
       <w:r>
         <w:drawing>
           <wp:inline xmlns:a="http://schemas.openxmlformats.org/drawingml/2006/main" xmlns:pic="http://schemas.openxmlformats.org/drawingml/2006/picture">
-            <wp:extent cx="1828800" cy="1828800"/>
+            <wp:extent cx="1371600" cy="1371600"/>
             <wp:docPr id="1" name="Picture 1"/>
             <wp:cNvGraphicFramePr>
               <a:graphicFrameLocks noChangeAspect="1"/>
@@ -22,7 +22,7 @@
               <a:graphicData uri="http://schemas.openxmlformats.org/drawingml/2006/picture">
                 <pic:pic>
                   <pic:nvPicPr>
-                    <pic:cNvPr id="0" name="mvgr_logo.png"/>
+                    <pic:cNvPr id="0" name="icon-512.png"/>
                     <pic:cNvPicPr/>
                   </pic:nvPicPr>
                   <pic:blipFill>
@@ -34,7 +34,7 @@
                   <pic:spPr>
                     <a:xfrm>
                       <a:off x="0" y="0"/>
-                      <a:ext cx="1828800" cy="1828800"/>
+                      <a:ext cx="1371600" cy="1371600"/>
                     </a:xfrm>
                     <a:prstGeom prst="rect"/>
                   </pic:spPr>

</xml_diff>

<commit_message>
Add actual MVGR college logo to title page (middle position)
Logo placed between guide designation and department name,
matching the exact template structure.

🤖 Generated with Codebuff
Co-Authored-By: Codebuff <noreply@codebuff.com>
</commit_message>
<xml_diff>
--- a/SmartGarbage_Community_Project_Report.docx
+++ b/SmartGarbage_Community_Project_Report.docx
@@ -5,46 +5,6 @@
     <w:p/>
     <w:p/>
     <w:p/>
-    <w:p>
-      <w:pPr>
-        <w:spacing w:after="160"/>
-        <w:jc w:val="center"/>
-      </w:pPr>
-      <w:r>
-        <w:drawing>
-          <wp:inline xmlns:a="http://schemas.openxmlformats.org/drawingml/2006/main" xmlns:pic="http://schemas.openxmlformats.org/drawingml/2006/picture">
-            <wp:extent cx="1371600" cy="1371600"/>
-            <wp:docPr id="1" name="Picture 1"/>
-            <wp:cNvGraphicFramePr>
-              <a:graphicFrameLocks noChangeAspect="1"/>
-            </wp:cNvGraphicFramePr>
-            <a:graphic>
-              <a:graphicData uri="http://schemas.openxmlformats.org/drawingml/2006/picture">
-                <pic:pic>
-                  <pic:nvPicPr>
-                    <pic:cNvPr id="0" name="icon-512.png"/>
-                    <pic:cNvPicPr/>
-                  </pic:nvPicPr>
-                  <pic:blipFill>
-                    <a:blip r:embed="rId9"/>
-                    <a:stretch>
-                      <a:fillRect/>
-                    </a:stretch>
-                  </pic:blipFill>
-                  <pic:spPr>
-                    <a:xfrm>
-                      <a:off x="0" y="0"/>
-                      <a:ext cx="1371600" cy="1371600"/>
-                    </a:xfrm>
-                    <a:prstGeom prst="rect"/>
-                  </pic:spPr>
-                </pic:pic>
-              </a:graphicData>
-            </a:graphic>
-          </wp:inline>
-        </w:drawing>
-      </w:r>
-    </w:p>
     <w:p>
       <w:pPr>
         <w:spacing w:after="480" w:before="0" w:line="240" w:lineRule="auto"/>
@@ -289,7 +249,46 @@
         <w:t>Assistant Professor</w:t>
       </w:r>
     </w:p>
-    <w:p/>
+    <w:p>
+      <w:pPr>
+        <w:spacing w:before="120" w:after="120"/>
+        <w:jc w:val="center"/>
+      </w:pPr>
+      <w:r>
+        <w:drawing>
+          <wp:inline xmlns:a="http://schemas.openxmlformats.org/drawingml/2006/main" xmlns:pic="http://schemas.openxmlformats.org/drawingml/2006/picture">
+            <wp:extent cx="2286000" cy="1481328"/>
+            <wp:docPr id="1" name="Picture 1"/>
+            <wp:cNvGraphicFramePr>
+              <a:graphicFrameLocks noChangeAspect="1"/>
+            </wp:cNvGraphicFramePr>
+            <a:graphic>
+              <a:graphicData uri="http://schemas.openxmlformats.org/drawingml/2006/picture">
+                <pic:pic>
+                  <pic:nvPicPr>
+                    <pic:cNvPr id="0" name="mvgr_logo.png"/>
+                    <pic:cNvPicPr/>
+                  </pic:nvPicPr>
+                  <pic:blipFill>
+                    <a:blip r:embed="rId9"/>
+                    <a:stretch>
+                      <a:fillRect/>
+                    </a:stretch>
+                  </pic:blipFill>
+                  <pic:spPr>
+                    <a:xfrm>
+                      <a:off x="0" y="0"/>
+                      <a:ext cx="2286000" cy="1481328"/>
+                    </a:xfrm>
+                    <a:prstGeom prst="rect"/>
+                  </pic:spPr>
+                </pic:pic>
+              </a:graphicData>
+            </a:graphic>
+          </wp:inline>
+        </w:drawing>
+      </w:r>
+    </w:p>
     <w:p>
       <w:pPr>
         <w:spacing w:after="120" w:before="0" w:line="240" w:lineRule="auto"/>

</xml_diff>

<commit_message>
Add MVGR logo to Certificate section and center all chapter headings
- Added college logo below CERTIFICATE heading (centered, 2in width)
- Changed all chapter headings (_h1) from left-aligned to center-aligned
- All 20 chapter headings verified centered in DOCX
- Regenerated both DOCX and PDF with updates

🤖 Generated with Codebuff
Co-Authored-By: Codebuff <noreply@codebuff.com>
</commit_message>
<xml_diff>
--- a/SmartGarbage_Community_Project_Report.docx
+++ b/SmartGarbage_Community_Project_Report.docx
@@ -372,7 +372,7 @@
     <w:p>
       <w:pPr>
         <w:spacing w:before="480" w:after="240" w:line="240" w:lineRule="auto"/>
-        <w:jc w:val="left"/>
+        <w:jc w:val="center"/>
       </w:pPr>
       <w:r>
         <w:rPr>
@@ -385,6 +385,46 @@
       </w:r>
     </w:p>
     <w:p/>
+    <w:p>
+      <w:pPr>
+        <w:spacing w:before="240" w:after="240"/>
+        <w:jc w:val="center"/>
+      </w:pPr>
+      <w:r>
+        <w:drawing>
+          <wp:inline xmlns:a="http://schemas.openxmlformats.org/drawingml/2006/main" xmlns:pic="http://schemas.openxmlformats.org/drawingml/2006/picture">
+            <wp:extent cx="1828800" cy="1185062"/>
+            <wp:docPr id="2" name="Picture 2"/>
+            <wp:cNvGraphicFramePr>
+              <a:graphicFrameLocks noChangeAspect="1"/>
+            </wp:cNvGraphicFramePr>
+            <a:graphic>
+              <a:graphicData uri="http://schemas.openxmlformats.org/drawingml/2006/picture">
+                <pic:pic>
+                  <pic:nvPicPr>
+                    <pic:cNvPr id="0" name="mvgr_logo.png"/>
+                    <pic:cNvPicPr/>
+                  </pic:nvPicPr>
+                  <pic:blipFill>
+                    <a:blip r:embed="rId9"/>
+                    <a:stretch>
+                      <a:fillRect/>
+                    </a:stretch>
+                  </pic:blipFill>
+                  <pic:spPr>
+                    <a:xfrm>
+                      <a:off x="0" y="0"/>
+                      <a:ext cx="1828800" cy="1185062"/>
+                    </a:xfrm>
+                    <a:prstGeom prst="rect"/>
+                  </pic:spPr>
+                </pic:pic>
+              </a:graphicData>
+            </a:graphic>
+          </wp:inline>
+        </w:drawing>
+      </w:r>
+    </w:p>
     <w:p>
       <w:pPr>
         <w:spacing w:after="120" w:before="0" w:line="240" w:lineRule="auto"/>
@@ -477,7 +517,7 @@
     <w:p>
       <w:pPr>
         <w:spacing w:before="480" w:after="240" w:line="240" w:lineRule="auto"/>
-        <w:jc w:val="left"/>
+        <w:jc w:val="center"/>
       </w:pPr>
       <w:r>
         <w:rPr>
@@ -574,7 +614,7 @@
     <w:p>
       <w:pPr>
         <w:spacing w:before="480" w:after="240" w:line="240" w:lineRule="auto"/>
-        <w:jc w:val="left"/>
+        <w:jc w:val="center"/>
       </w:pPr>
       <w:r>
         <w:rPr>
@@ -640,7 +680,7 @@
     <w:p>
       <w:pPr>
         <w:spacing w:before="480" w:after="240" w:line="240" w:lineRule="auto"/>
-        <w:jc w:val="left"/>
+        <w:jc w:val="center"/>
       </w:pPr>
       <w:r>
         <w:rPr>
@@ -751,7 +791,7 @@
     <w:p>
       <w:pPr>
         <w:spacing w:before="480" w:after="240" w:line="240" w:lineRule="auto"/>
-        <w:jc w:val="left"/>
+        <w:jc w:val="center"/>
       </w:pPr>
       <w:r>
         <w:rPr>
@@ -2131,7 +2171,7 @@
     <w:p>
       <w:pPr>
         <w:spacing w:before="480" w:after="240" w:line="240" w:lineRule="auto"/>
-        <w:jc w:val="left"/>
+        <w:jc w:val="center"/>
       </w:pPr>
       <w:r>
         <w:rPr>
@@ -2391,7 +2431,7 @@
     <w:p>
       <w:pPr>
         <w:spacing w:before="480" w:after="240" w:line="240" w:lineRule="auto"/>
-        <w:jc w:val="left"/>
+        <w:jc w:val="center"/>
       </w:pPr>
       <w:r>
         <w:rPr>
@@ -2636,7 +2676,7 @@
     <w:p>
       <w:pPr>
         <w:spacing w:before="480" w:after="240" w:line="240" w:lineRule="auto"/>
-        <w:jc w:val="left"/>
+        <w:jc w:val="center"/>
       </w:pPr>
       <w:r>
         <w:rPr>
@@ -4393,7 +4433,7 @@
     <w:p>
       <w:pPr>
         <w:spacing w:before="480" w:after="240" w:line="240" w:lineRule="auto"/>
-        <w:jc w:val="left"/>
+        <w:jc w:val="center"/>
       </w:pPr>
       <w:r>
         <w:rPr>
@@ -5607,7 +5647,7 @@
         <w:drawing>
           <wp:inline xmlns:a="http://schemas.openxmlformats.org/drawingml/2006/main" xmlns:pic="http://schemas.openxmlformats.org/drawingml/2006/picture">
             <wp:extent cx="5029200" cy="3536255"/>
-            <wp:docPr id="2" name="Picture 2"/>
+            <wp:docPr id="3" name="Picture 3"/>
             <wp:cNvGraphicFramePr>
               <a:graphicFrameLocks noChangeAspect="1"/>
             </wp:cNvGraphicFramePr>
@@ -6498,7 +6538,7 @@
         <w:drawing>
           <wp:inline xmlns:a="http://schemas.openxmlformats.org/drawingml/2006/main" xmlns:pic="http://schemas.openxmlformats.org/drawingml/2006/picture">
             <wp:extent cx="5029200" cy="5602843"/>
-            <wp:docPr id="3" name="Picture 3"/>
+            <wp:docPr id="4" name="Picture 4"/>
             <wp:cNvGraphicFramePr>
               <a:graphicFrameLocks noChangeAspect="1"/>
             </wp:cNvGraphicFramePr>
@@ -6628,7 +6668,7 @@
         <w:drawing>
           <wp:inline xmlns:a="http://schemas.openxmlformats.org/drawingml/2006/main" xmlns:pic="http://schemas.openxmlformats.org/drawingml/2006/picture">
             <wp:extent cx="5029200" cy="3049150"/>
-            <wp:docPr id="4" name="Picture 4"/>
+            <wp:docPr id="5" name="Picture 5"/>
             <wp:cNvGraphicFramePr>
               <a:graphicFrameLocks noChangeAspect="1"/>
             </wp:cNvGraphicFramePr>
@@ -6763,7 +6803,7 @@
         <w:drawing>
           <wp:inline xmlns:a="http://schemas.openxmlformats.org/drawingml/2006/main" xmlns:pic="http://schemas.openxmlformats.org/drawingml/2006/picture">
             <wp:extent cx="5029200" cy="3049150"/>
-            <wp:docPr id="5" name="Picture 5"/>
+            <wp:docPr id="6" name="Picture 6"/>
             <wp:cNvGraphicFramePr>
               <a:graphicFrameLocks noChangeAspect="1"/>
             </wp:cNvGraphicFramePr>
@@ -6802,7 +6842,7 @@
     <w:p>
       <w:pPr>
         <w:spacing w:before="480" w:after="240" w:line="240" w:lineRule="auto"/>
-        <w:jc w:val="left"/>
+        <w:jc w:val="center"/>
       </w:pPr>
       <w:r>
         <w:rPr>
@@ -8172,7 +8212,7 @@
     <w:p>
       <w:pPr>
         <w:spacing w:before="480" w:after="240" w:line="240" w:lineRule="auto"/>
-        <w:jc w:val="left"/>
+        <w:jc w:val="center"/>
       </w:pPr>
       <w:r>
         <w:rPr>
@@ -10595,7 +10635,7 @@
     <w:p>
       <w:pPr>
         <w:spacing w:before="480" w:after="240" w:line="240" w:lineRule="auto"/>
-        <w:jc w:val="left"/>
+        <w:jc w:val="center"/>
       </w:pPr>
       <w:r>
         <w:rPr>
@@ -11106,7 +11146,7 @@
     <w:p>
       <w:pPr>
         <w:spacing w:before="480" w:after="240" w:line="240" w:lineRule="auto"/>
-        <w:jc w:val="left"/>
+        <w:jc w:val="center"/>
       </w:pPr>
       <w:r>
         <w:rPr>
@@ -11446,7 +11486,7 @@
     <w:p>
       <w:pPr>
         <w:spacing w:before="480" w:after="240" w:line="240" w:lineRule="auto"/>
-        <w:jc w:val="left"/>
+        <w:jc w:val="center"/>
       </w:pPr>
       <w:r>
         <w:rPr>
@@ -11566,7 +11606,7 @@
     <w:p>
       <w:pPr>
         <w:spacing w:before="480" w:after="240" w:line="240" w:lineRule="auto"/>
-        <w:jc w:val="left"/>
+        <w:jc w:val="center"/>
       </w:pPr>
       <w:r>
         <w:rPr>
@@ -11946,7 +11986,7 @@
     <w:p>
       <w:pPr>
         <w:spacing w:before="480" w:after="240" w:line="240" w:lineRule="auto"/>
-        <w:jc w:val="left"/>
+        <w:jc w:val="center"/>
       </w:pPr>
       <w:r>
         <w:rPr>
@@ -12267,7 +12307,7 @@
     <w:p>
       <w:pPr>
         <w:spacing w:before="480" w:after="240" w:line="240" w:lineRule="auto"/>
-        <w:jc w:val="left"/>
+        <w:jc w:val="center"/>
       </w:pPr>
       <w:r>
         <w:rPr>
@@ -14159,7 +14199,7 @@
     <w:p>
       <w:pPr>
         <w:spacing w:before="480" w:after="240" w:line="240" w:lineRule="auto"/>
-        <w:jc w:val="left"/>
+        <w:jc w:val="center"/>
       </w:pPr>
       <w:r>
         <w:rPr>
@@ -14329,7 +14369,7 @@
     <w:p>
       <w:pPr>
         <w:spacing w:before="480" w:after="240" w:line="240" w:lineRule="auto"/>
-        <w:jc w:val="left"/>
+        <w:jc w:val="center"/>
       </w:pPr>
       <w:r>
         <w:rPr>

</xml_diff>

<commit_message>
Add 3 new diagrams, fix formatting issues, remove keywords
New diagrams:
- Security Architecture (5-layer: Transport → Headers → Auth → App → Infra)
- Data Flow Diagram (entities → processes → data stores)
- Database ER Diagram (9 entities with PK/FK relationships)

Formatting fixes:
- Removed Keywords line from abstract (both DOCX and PDF)
- Challenges section: Problem and Solution now on separate lines
- All 20 chapter headings verified centered
- 12 figure captions (7 diagrams + 5 result placeholders)

🤖 Generated with Codebuff
Co-Authored-By: Codebuff <noreply@codebuff.com>
</commit_message>
<xml_diff>
--- a/SmartGarbage_Community_Project_Report.docx
+++ b/SmartGarbage_Community_Project_Report.docx
@@ -769,21 +769,6 @@
       </w:r>
     </w:p>
     <w:p>
-      <w:pPr>
-        <w:spacing w:after="240" w:before="0" w:line="240" w:lineRule="auto"/>
-        <w:jc w:val="both"/>
-      </w:pPr>
-      <w:r>
-        <w:rPr>
-          <w:rFonts w:ascii="Times New Roman" w:hAnsi="Times New Roman" w:eastAsia="Times New Roman"/>
-          <w:b w:val="0"/>
-          <w:i/>
-          <w:sz w:val="24"/>
-        </w:rPr>
-        <w:t>Keywords: Smart Waste Management, Community Governance, IoT, Machine Learning, Digital India</w:t>
-      </w:r>
-    </w:p>
-    <w:p>
       <w:r>
         <w:br w:type="page"/>
       </w:r>
@@ -4426,6 +4411,61 @@
     </w:tbl>
     <w:p/>
     <w:p>
+      <w:pPr>
+        <w:spacing w:after="240" w:before="0" w:line="240" w:lineRule="auto"/>
+        <w:jc w:val="center"/>
+      </w:pPr>
+      <w:r>
+        <w:rPr>
+          <w:rFonts w:ascii="Times New Roman" w:hAnsi="Times New Roman" w:eastAsia="Times New Roman"/>
+          <w:b/>
+          <w:i w:val="0"/>
+          <w:sz w:val="24"/>
+        </w:rPr>
+        <w:t>Figure 3.1: Database Entity-Relationship Diagram</w:t>
+      </w:r>
+    </w:p>
+    <w:p>
+      <w:pPr>
+        <w:spacing w:before="120" w:after="120"/>
+        <w:jc w:val="center"/>
+      </w:pPr>
+      <w:r>
+        <w:drawing>
+          <wp:inline xmlns:a="http://schemas.openxmlformats.org/drawingml/2006/main" xmlns:pic="http://schemas.openxmlformats.org/drawingml/2006/picture">
+            <wp:extent cx="5029200" cy="3336599"/>
+            <wp:docPr id="3" name="Picture 3"/>
+            <wp:cNvGraphicFramePr>
+              <a:graphicFrameLocks noChangeAspect="1"/>
+            </wp:cNvGraphicFramePr>
+            <a:graphic>
+              <a:graphicData uri="http://schemas.openxmlformats.org/drawingml/2006/picture">
+                <pic:pic>
+                  <pic:nvPicPr>
+                    <pic:cNvPr id="0" name="database_er_diagram.png"/>
+                    <pic:cNvPicPr/>
+                  </pic:nvPicPr>
+                  <pic:blipFill>
+                    <a:blip r:embed="rId10"/>
+                    <a:stretch>
+                      <a:fillRect/>
+                    </a:stretch>
+                  </pic:blipFill>
+                  <pic:spPr>
+                    <a:xfrm>
+                      <a:off x="0" y="0"/>
+                      <a:ext cx="5029200" cy="3336599"/>
+                    </a:xfrm>
+                    <a:prstGeom prst="rect"/>
+                  </pic:spPr>
+                </pic:pic>
+              </a:graphicData>
+            </a:graphic>
+          </wp:inline>
+        </w:drawing>
+      </w:r>
+    </w:p>
+    <w:p>
       <w:r>
         <w:br w:type="page"/>
       </w:r>
@@ -5647,7 +5687,7 @@
         <w:drawing>
           <wp:inline xmlns:a="http://schemas.openxmlformats.org/drawingml/2006/main" xmlns:pic="http://schemas.openxmlformats.org/drawingml/2006/picture">
             <wp:extent cx="5029200" cy="3536255"/>
-            <wp:docPr id="3" name="Picture 3"/>
+            <wp:docPr id="4" name="Picture 4"/>
             <wp:cNvGraphicFramePr>
               <a:graphicFrameLocks noChangeAspect="1"/>
             </wp:cNvGraphicFramePr>
@@ -5659,7 +5699,7 @@
                     <pic:cNvPicPr/>
                   </pic:nvPicPr>
                   <pic:blipFill>
-                    <a:blip r:embed="rId10"/>
+                    <a:blip r:embed="rId11"/>
                     <a:stretch>
                       <a:fillRect/>
                     </a:stretch>
@@ -6538,7 +6578,7 @@
         <w:drawing>
           <wp:inline xmlns:a="http://schemas.openxmlformats.org/drawingml/2006/main" xmlns:pic="http://schemas.openxmlformats.org/drawingml/2006/picture">
             <wp:extent cx="5029200" cy="5602843"/>
-            <wp:docPr id="4" name="Picture 4"/>
+            <wp:docPr id="5" name="Picture 5"/>
             <wp:cNvGraphicFramePr>
               <a:graphicFrameLocks noChangeAspect="1"/>
             </wp:cNvGraphicFramePr>
@@ -6550,7 +6590,7 @@
                     <pic:cNvPicPr/>
                   </pic:nvPicPr>
                   <pic:blipFill>
-                    <a:blip r:embed="rId11"/>
+                    <a:blip r:embed="rId12"/>
                     <a:stretch>
                       <a:fillRect/>
                     </a:stretch>
@@ -6601,6 +6641,61 @@
     </w:p>
     <w:p>
       <w:pPr>
+        <w:spacing w:after="240" w:before="0" w:line="240" w:lineRule="auto"/>
+        <w:jc w:val="center"/>
+      </w:pPr>
+      <w:r>
+        <w:rPr>
+          <w:rFonts w:ascii="Times New Roman" w:hAnsi="Times New Roman" w:eastAsia="Times New Roman"/>
+          <w:b/>
+          <w:i w:val="0"/>
+          <w:sz w:val="24"/>
+        </w:rPr>
+        <w:t>Figure 4.5: Data Flow Diagram</w:t>
+      </w:r>
+    </w:p>
+    <w:p>
+      <w:pPr>
+        <w:spacing w:before="120" w:after="120"/>
+        <w:jc w:val="center"/>
+      </w:pPr>
+      <w:r>
+        <w:drawing>
+          <wp:inline xmlns:a="http://schemas.openxmlformats.org/drawingml/2006/main" xmlns:pic="http://schemas.openxmlformats.org/drawingml/2006/picture">
+            <wp:extent cx="5029200" cy="3181315"/>
+            <wp:docPr id="6" name="Picture 6"/>
+            <wp:cNvGraphicFramePr>
+              <a:graphicFrameLocks noChangeAspect="1"/>
+            </wp:cNvGraphicFramePr>
+            <a:graphic>
+              <a:graphicData uri="http://schemas.openxmlformats.org/drawingml/2006/picture">
+                <pic:pic>
+                  <pic:nvPicPr>
+                    <pic:cNvPr id="0" name="data_flow_diagram.png"/>
+                    <pic:cNvPicPr/>
+                  </pic:nvPicPr>
+                  <pic:blipFill>
+                    <a:blip r:embed="rId13"/>
+                    <a:stretch>
+                      <a:fillRect/>
+                    </a:stretch>
+                  </pic:blipFill>
+                  <pic:spPr>
+                    <a:xfrm>
+                      <a:off x="0" y="0"/>
+                      <a:ext cx="5029200" cy="3181315"/>
+                    </a:xfrm>
+                    <a:prstGeom prst="rect"/>
+                  </pic:spPr>
+                </pic:pic>
+              </a:graphicData>
+            </a:graphic>
+          </wp:inline>
+        </w:drawing>
+      </w:r>
+    </w:p>
+    <w:p>
+      <w:pPr>
         <w:spacing w:before="360" w:after="160" w:line="240" w:lineRule="auto"/>
         <w:jc w:val="left"/>
       </w:pPr>
@@ -6668,7 +6763,7 @@
         <w:drawing>
           <wp:inline xmlns:a="http://schemas.openxmlformats.org/drawingml/2006/main" xmlns:pic="http://schemas.openxmlformats.org/drawingml/2006/picture">
             <wp:extent cx="5029200" cy="3049150"/>
-            <wp:docPr id="5" name="Picture 5"/>
+            <wp:docPr id="7" name="Picture 7"/>
             <wp:cNvGraphicFramePr>
               <a:graphicFrameLocks noChangeAspect="1"/>
             </wp:cNvGraphicFramePr>
@@ -6680,7 +6775,7 @@
                     <pic:cNvPicPr/>
                   </pic:nvPicPr>
                   <pic:blipFill>
-                    <a:blip r:embed="rId12"/>
+                    <a:blip r:embed="rId14"/>
                     <a:stretch>
                       <a:fillRect/>
                     </a:stretch>
@@ -6741,6 +6836,61 @@
     </w:p>
     <w:p>
       <w:pPr>
+        <w:spacing w:after="240" w:before="0" w:line="240" w:lineRule="auto"/>
+        <w:jc w:val="center"/>
+      </w:pPr>
+      <w:r>
+        <w:rPr>
+          <w:rFonts w:ascii="Times New Roman" w:hAnsi="Times New Roman" w:eastAsia="Times New Roman"/>
+          <w:b/>
+          <w:i w:val="0"/>
+          <w:sz w:val="24"/>
+        </w:rPr>
+        <w:t>Figure 4.8: Security Architecture Diagram</w:t>
+      </w:r>
+    </w:p>
+    <w:p>
+      <w:pPr>
+        <w:spacing w:before="120" w:after="120"/>
+        <w:jc w:val="center"/>
+      </w:pPr>
+      <w:r>
+        <w:drawing>
+          <wp:inline xmlns:a="http://schemas.openxmlformats.org/drawingml/2006/main" xmlns:pic="http://schemas.openxmlformats.org/drawingml/2006/picture">
+            <wp:extent cx="5029200" cy="4010660"/>
+            <wp:docPr id="8" name="Picture 8"/>
+            <wp:cNvGraphicFramePr>
+              <a:graphicFrameLocks noChangeAspect="1"/>
+            </wp:cNvGraphicFramePr>
+            <a:graphic>
+              <a:graphicData uri="http://schemas.openxmlformats.org/drawingml/2006/picture">
+                <pic:pic>
+                  <pic:nvPicPr>
+                    <pic:cNvPr id="0" name="security_architecture.png"/>
+                    <pic:cNvPicPr/>
+                  </pic:nvPicPr>
+                  <pic:blipFill>
+                    <a:blip r:embed="rId15"/>
+                    <a:stretch>
+                      <a:fillRect/>
+                    </a:stretch>
+                  </pic:blipFill>
+                  <pic:spPr>
+                    <a:xfrm>
+                      <a:off x="0" y="0"/>
+                      <a:ext cx="5029200" cy="4010660"/>
+                    </a:xfrm>
+                    <a:prstGeom prst="rect"/>
+                  </pic:spPr>
+                </pic:pic>
+              </a:graphicData>
+            </a:graphic>
+          </wp:inline>
+        </w:drawing>
+      </w:r>
+    </w:p>
+    <w:p>
+      <w:pPr>
         <w:spacing w:before="360" w:after="160" w:line="240" w:lineRule="auto"/>
         <w:jc w:val="left"/>
       </w:pPr>
@@ -6803,7 +6953,7 @@
         <w:drawing>
           <wp:inline xmlns:a="http://schemas.openxmlformats.org/drawingml/2006/main" xmlns:pic="http://schemas.openxmlformats.org/drawingml/2006/picture">
             <wp:extent cx="5029200" cy="3049150"/>
-            <wp:docPr id="6" name="Picture 6"/>
+            <wp:docPr id="9" name="Picture 9"/>
             <wp:cNvGraphicFramePr>
               <a:graphicFrameLocks noChangeAspect="1"/>
             </wp:cNvGraphicFramePr>
@@ -6815,7 +6965,7 @@
                     <pic:cNvPicPr/>
                   </pic:nvPicPr>
                   <pic:blipFill>
-                    <a:blip r:embed="rId13"/>
+                    <a:blip r:embed="rId16"/>
                     <a:stretch>
                       <a:fillRect/>
                     </a:stretch>
@@ -11175,7 +11325,7 @@
     </w:p>
     <w:p>
       <w:pPr>
-        <w:spacing w:after="120" w:before="0" w:line="240" w:lineRule="auto"/>
+        <w:spacing w:after="40" w:before="0" w:line="240" w:lineRule="auto"/>
         <w:jc w:val="both"/>
       </w:pPr>
       <w:r>
@@ -11186,7 +11336,20 @@
           <w:sz w:val="24"/>
         </w:rPr>
         <w:t>Problem: Insufficient historical telemetry for ML</w:t>
-        <w:br/>
+      </w:r>
+    </w:p>
+    <w:p>
+      <w:pPr>
+        <w:spacing w:after="200" w:before="0" w:line="240" w:lineRule="auto"/>
+        <w:jc w:val="both"/>
+      </w:pPr>
+      <w:r>
+        <w:rPr>
+          <w:rFonts w:ascii="Times New Roman" w:hAnsi="Times New Roman" w:eastAsia="Times New Roman"/>
+          <w:b w:val="0"/>
+          <w:i w:val="0"/>
+          <w:sz w:val="24"/>
+        </w:rPr>
         <w:t>Solution: Generated 600-row synthetic dataset; documented limitation for future work</w:t>
       </w:r>
     </w:p>
@@ -11207,7 +11370,7 @@
     </w:p>
     <w:p>
       <w:pPr>
-        <w:spacing w:after="120" w:before="0" w:line="240" w:lineRule="auto"/>
+        <w:spacing w:after="40" w:before="0" w:line="240" w:lineRule="auto"/>
         <w:jc w:val="both"/>
       </w:pPr>
       <w:r>
@@ -11218,7 +11381,20 @@
           <w:sz w:val="24"/>
         </w:rPr>
         <w:t>Problem: Complaint filing without internet</w:t>
-        <w:br/>
+      </w:r>
+    </w:p>
+    <w:p>
+      <w:pPr>
+        <w:spacing w:after="200" w:before="0" w:line="240" w:lineRule="auto"/>
+        <w:jc w:val="both"/>
+      </w:pPr>
+      <w:r>
+        <w:rPr>
+          <w:rFonts w:ascii="Times New Roman" w:hAnsi="Times New Roman" w:eastAsia="Times New Roman"/>
+          <w:b w:val="0"/>
+          <w:i w:val="0"/>
+          <w:sz w:val="24"/>
+        </w:rPr>
         <w:t>Solution: Service Worker + IndexedDB + Background Sync API</w:t>
       </w:r>
     </w:p>
@@ -11239,7 +11415,7 @@
     </w:p>
     <w:p>
       <w:pPr>
-        <w:spacing w:after="120" w:before="0" w:line="240" w:lineRule="auto"/>
+        <w:spacing w:after="40" w:before="0" w:line="240" w:lineRule="auto"/>
         <w:jc w:val="both"/>
       </w:pPr>
       <w:r>
@@ -11250,7 +11426,20 @@
           <w:sz w:val="24"/>
         </w:rPr>
         <w:t>Problem: Live dashboard without refresh</w:t>
-        <w:br/>
+      </w:r>
+    </w:p>
+    <w:p>
+      <w:pPr>
+        <w:spacing w:after="200" w:before="0" w:line="240" w:lineRule="auto"/>
+        <w:jc w:val="both"/>
+      </w:pPr>
+      <w:r>
+        <w:rPr>
+          <w:rFonts w:ascii="Times New Roman" w:hAnsi="Times New Roman" w:eastAsia="Times New Roman"/>
+          <w:b w:val="0"/>
+          <w:i w:val="0"/>
+          <w:sz w:val="24"/>
+        </w:rPr>
         <w:t>Solution: Flask-SocketIO with Redis broker</w:t>
       </w:r>
     </w:p>
@@ -11271,7 +11460,7 @@
     </w:p>
     <w:p>
       <w:pPr>
-        <w:spacing w:after="120" w:before="0" w:line="240" w:lineRule="auto"/>
+        <w:spacing w:after="40" w:before="0" w:line="240" w:lineRule="auto"/>
         <w:jc w:val="both"/>
       </w:pPr>
       <w:r>
@@ -11282,7 +11471,20 @@
           <w:sz w:val="24"/>
         </w:rPr>
         <w:t>Problem: No physical hardware</w:t>
-        <w:br/>
+      </w:r>
+    </w:p>
+    <w:p>
+      <w:pPr>
+        <w:spacing w:after="200" w:before="0" w:line="240" w:lineRule="auto"/>
+        <w:jc w:val="both"/>
+      </w:pPr>
+      <w:r>
+        <w:rPr>
+          <w:rFonts w:ascii="Times New Roman" w:hAnsi="Times New Roman" w:eastAsia="Times New Roman"/>
+          <w:b w:val="0"/>
+          <w:i w:val="0"/>
+          <w:sz w:val="24"/>
+        </w:rPr>
         <w:t>Solution: Authenticated API with test data generators</w:t>
       </w:r>
     </w:p>
@@ -11303,7 +11505,7 @@
     </w:p>
     <w:p>
       <w:pPr>
-        <w:spacing w:after="120" w:before="0" w:line="240" w:lineRule="auto"/>
+        <w:spacing w:after="40" w:before="0" w:line="240" w:lineRule="auto"/>
         <w:jc w:val="both"/>
       </w:pPr>
       <w:r>
@@ -11314,7 +11516,20 @@
           <w:sz w:val="24"/>
         </w:rPr>
         <w:t>Problem: Comprehensive security without usability loss</w:t>
-        <w:br/>
+      </w:r>
+    </w:p>
+    <w:p>
+      <w:pPr>
+        <w:spacing w:after="200" w:before="0" w:line="240" w:lineRule="auto"/>
+        <w:jc w:val="both"/>
+      </w:pPr>
+      <w:r>
+        <w:rPr>
+          <w:rFonts w:ascii="Times New Roman" w:hAnsi="Times New Roman" w:eastAsia="Times New Roman"/>
+          <w:b w:val="0"/>
+          <w:i w:val="0"/>
+          <w:sz w:val="24"/>
+        </w:rPr>
         <w:t>Solution: All 9 OWASP headers via Flask-Talisman</w:t>
       </w:r>
     </w:p>
@@ -11335,7 +11550,7 @@
     </w:p>
     <w:p>
       <w:pPr>
-        <w:spacing w:after="120" w:before="0" w:line="240" w:lineRule="auto"/>
+        <w:spacing w:after="40" w:before="0" w:line="240" w:lineRule="auto"/>
         <w:jc w:val="both"/>
       </w:pPr>
       <w:r>
@@ -11346,7 +11561,20 @@
           <w:sz w:val="24"/>
         </w:rPr>
         <w:t>Problem: TTFB on free-tier hosting</w:t>
-        <w:br/>
+      </w:r>
+    </w:p>
+    <w:p>
+      <w:pPr>
+        <w:spacing w:after="200" w:before="0" w:line="240" w:lineRule="auto"/>
+        <w:jc w:val="both"/>
+      </w:pPr>
+      <w:r>
+        <w:rPr>
+          <w:rFonts w:ascii="Times New Roman" w:hAnsi="Times New Roman" w:eastAsia="Times New Roman"/>
+          <w:b w:val="0"/>
+          <w:i w:val="0"/>
+          <w:sz w:val="24"/>
+        </w:rPr>
         <w:t>Solution: Multi-layer caching, Brotli, preload hints</w:t>
       </w:r>
     </w:p>
@@ -11367,7 +11595,7 @@
     </w:p>
     <w:p>
       <w:pPr>
-        <w:spacing w:after="120" w:before="0" w:line="240" w:lineRule="auto"/>
+        <w:spacing w:after="40" w:before="0" w:line="240" w:lineRule="auto"/>
         <w:jc w:val="both"/>
       </w:pPr>
       <w:r>
@@ -11378,7 +11606,20 @@
           <w:sz w:val="24"/>
         </w:rPr>
         <w:t>Problem: Consistent translations</w:t>
-        <w:br/>
+      </w:r>
+    </w:p>
+    <w:p>
+      <w:pPr>
+        <w:spacing w:after="200" w:before="0" w:line="240" w:lineRule="auto"/>
+        <w:jc w:val="both"/>
+      </w:pPr>
+      <w:r>
+        <w:rPr>
+          <w:rFonts w:ascii="Times New Roman" w:hAnsi="Times New Roman" w:eastAsia="Times New Roman"/>
+          <w:b w:val="0"/>
+          <w:i w:val="0"/>
+          <w:sz w:val="24"/>
+        </w:rPr>
         <w:t>Solution: Flask-Babel with gettext markers</w:t>
       </w:r>
     </w:p>
@@ -11399,7 +11640,7 @@
     </w:p>
     <w:p>
       <w:pPr>
-        <w:spacing w:after="120" w:before="0" w:line="240" w:lineRule="auto"/>
+        <w:spacing w:after="40" w:before="0" w:line="240" w:lineRule="auto"/>
         <w:jc w:val="both"/>
       </w:pPr>
       <w:r>
@@ -11410,7 +11651,20 @@
           <w:sz w:val="24"/>
         </w:rPr>
         <w:t>Problem: Reliable delivery</w:t>
-        <w:br/>
+      </w:r>
+    </w:p>
+    <w:p>
+      <w:pPr>
+        <w:spacing w:after="200" w:before="0" w:line="240" w:lineRule="auto"/>
+        <w:jc w:val="both"/>
+      </w:pPr>
+      <w:r>
+        <w:rPr>
+          <w:rFonts w:ascii="Times New Roman" w:hAnsi="Times New Roman" w:eastAsia="Times New Roman"/>
+          <w:b w:val="0"/>
+          <w:i w:val="0"/>
+          <w:sz w:val="24"/>
+        </w:rPr>
         <w:t>Solution: pywebpush with VAPID + preference filtering</w:t>
       </w:r>
     </w:p>
@@ -11431,7 +11685,7 @@
     </w:p>
     <w:p>
       <w:pPr>
-        <w:spacing w:after="120" w:before="0" w:line="240" w:lineRule="auto"/>
+        <w:spacing w:after="40" w:before="0" w:line="240" w:lineRule="auto"/>
         <w:jc w:val="both"/>
       </w:pPr>
       <w:r>
@@ -11442,7 +11696,20 @@
           <w:sz w:val="24"/>
         </w:rPr>
         <w:t>Problem: Dev/prod consistency</w:t>
-        <w:br/>
+      </w:r>
+    </w:p>
+    <w:p>
+      <w:pPr>
+        <w:spacing w:after="200" w:before="0" w:line="240" w:lineRule="auto"/>
+        <w:jc w:val="both"/>
+      </w:pPr>
+      <w:r>
+        <w:rPr>
+          <w:rFonts w:ascii="Times New Roman" w:hAnsi="Times New Roman" w:eastAsia="Times New Roman"/>
+          <w:b w:val="0"/>
+          <w:i w:val="0"/>
+          <w:sz w:val="24"/>
+        </w:rPr>
         <w:t>Solution: Docker containerization + env vars + health check</w:t>
       </w:r>
     </w:p>
@@ -11463,7 +11730,7 @@
     </w:p>
     <w:p>
       <w:pPr>
-        <w:spacing w:after="120" w:before="0" w:line="240" w:lineRule="auto"/>
+        <w:spacing w:after="40" w:before="0" w:line="240" w:lineRule="auto"/>
         <w:jc w:val="both"/>
       </w:pPr>
       <w:r>
@@ -11474,7 +11741,20 @@
           <w:sz w:val="24"/>
         </w:rPr>
         <w:t>Problem: Testing without live merchant</w:t>
-        <w:br/>
+      </w:r>
+    </w:p>
+    <w:p>
+      <w:pPr>
+        <w:spacing w:after="200" w:before="0" w:line="240" w:lineRule="auto"/>
+        <w:jc w:val="both"/>
+      </w:pPr>
+      <w:r>
+        <w:rPr>
+          <w:rFonts w:ascii="Times New Roman" w:hAnsi="Times New Roman" w:eastAsia="Times New Roman"/>
+          <w:b w:val="0"/>
+          <w:i w:val="0"/>
+          <w:sz w:val="24"/>
+        </w:rPr>
         <w:t>Solution: Razorpay test keys + UPI primary method</w:t>
       </w:r>
     </w:p>

</xml_diff>